<commit_message>
update tai lieu HDSD
</commit_message>
<xml_diff>
--- a/.Document/Tai lieu HDSD/I. BAN HANG/1. HDSD_BanHang_TVBH.docx
+++ b/.Document/Tai lieu HDSD/I. BAN HANG/1. HDSD_BanHang_TVBH.docx
@@ -22,7 +22,6 @@
       </w:sdtPr>
       <w:sdtEndPr>
         <w:rPr>
-          <w:b/>
           <w:bCs/>
         </w:rPr>
       </w:sdtEndPr>
@@ -35,13 +34,10 @@
               <w:numId w:val="0"/>
             </w:numPr>
             <w:ind w:left="720"/>
-            <w:jc w:val="center"/>
           </w:pPr>
           <w:r>
             <w:t>TVBH – QUY TRÌNH BÁN HÀNG</w:t>
           </w:r>
-          <w:bookmarkStart w:id="1" w:name="_GoBack"/>
-          <w:bookmarkEnd w:id="1"/>
         </w:p>
         <w:p>
           <w:pPr>
@@ -3029,19 +3025,34 @@
         <w:jc w:val="center"/>
         <w:rPr>
           <w:rFonts w:ascii="Times New Roman" w:hAnsi="Times New Roman" w:cs="Times New Roman"/>
-          <w:sz w:val="28"/>
-          <w:szCs w:val="28"/>
-        </w:rPr>
-      </w:pPr>
-      <w:r>
-        <w:rPr>
-          <w:rFonts w:ascii="Times New Roman" w:hAnsi="Times New Roman" w:cs="Times New Roman"/>
-          <w:sz w:val="28"/>
+          <w:b/>
+          <w:sz w:val="36"/>
+          <w:szCs w:val="28"/>
+          <w:lang w:val="en-US"/>
+        </w:rPr>
+      </w:pPr>
+      <w:r>
+        <w:rPr>
+          <w:rFonts w:ascii="Times New Roman" w:hAnsi="Times New Roman" w:cs="Times New Roman"/>
+          <w:b/>
+          <w:sz w:val="36"/>
           <w:szCs w:val="28"/>
         </w:rPr>
         <w:lastRenderedPageBreak/>
-        <w:t>TVBH – Quy trình bán hàng</w:t>
-      </w:r>
+        <w:t xml:space="preserve">TVBH – </w:t>
+      </w:r>
+      <w:r>
+        <w:rPr>
+          <w:rFonts w:ascii="Times New Roman" w:hAnsi="Times New Roman" w:cs="Times New Roman"/>
+          <w:b/>
+          <w:sz w:val="36"/>
+          <w:szCs w:val="28"/>
+          <w:lang w:val="en-US"/>
+        </w:rPr>
+        <w:t>QUY TRÌNH BÁN HÀNG</w:t>
+      </w:r>
+      <w:bookmarkStart w:id="1" w:name="_GoBack"/>
+      <w:bookmarkEnd w:id="1"/>
     </w:p>
     <w:p>
       <w:pPr>
@@ -4129,13 +4140,12 @@
           <w:rFonts w:ascii="Times New Roman" w:hAnsi="Times New Roman" w:cs="Times New Roman"/>
           <w:sz w:val="28"/>
           <w:szCs w:val="28"/>
-          <w:lang w:val="en-GB"/>
         </w:rPr>
         <w:drawing>
-          <wp:inline distT="0" distB="0" distL="0" distR="0" wp14:anchorId="2714CD66" wp14:editId="33159AFE">
-            <wp:extent cx="5731510" cy="3087370"/>
+          <wp:inline distT="0" distB="0" distL="0" distR="0" wp14:anchorId="3DCD96A1" wp14:editId="42B8D267">
+            <wp:extent cx="5731510" cy="3152140"/>
             <wp:effectExtent l="0" t="0" r="2540" b="0"/>
-            <wp:docPr id="958446509" name="Picture 1"/>
+            <wp:docPr id="2" name="Picture 2"/>
             <wp:cNvGraphicFramePr>
               <a:graphicFrameLocks xmlns:a="http://schemas.openxmlformats.org/drawingml/2006/main" noChangeAspect="1"/>
             </wp:cNvGraphicFramePr>
@@ -4143,7 +4153,7 @@
               <a:graphicData uri="http://schemas.openxmlformats.org/drawingml/2006/picture">
                 <pic:pic xmlns:pic="http://schemas.openxmlformats.org/drawingml/2006/picture">
                   <pic:nvPicPr>
-                    <pic:cNvPr id="958446509" name=""/>
+                    <pic:cNvPr id="1" name=""/>
                     <pic:cNvPicPr/>
                   </pic:nvPicPr>
                   <pic:blipFill>
@@ -4155,7 +4165,7 @@
                   <pic:spPr>
                     <a:xfrm>
                       <a:off x="0" y="0"/>
-                      <a:ext cx="5731510" cy="3087370"/>
+                      <a:ext cx="5731510" cy="3152140"/>
                     </a:xfrm>
                     <a:prstGeom prst="rect">
                       <a:avLst/>
@@ -4364,6 +4374,98 @@
           <w:rFonts w:ascii="Times New Roman" w:hAnsi="Times New Roman" w:cs="Times New Roman"/>
           <w:sz w:val="28"/>
           <w:szCs w:val="28"/>
+          <w:lang w:val="en-US"/>
+        </w:rPr>
+        <w:t>User kiểm tra và hoàn thiện thông tin khách hàng, thông tin cần phải đúng với giấy tờ (Đúng thông tin công ty theo MST đối với khách hàng doanh nghiệp, Đúng thông tin cá nhân theo CCCD đối với khách hàng là cá nhân)</w:t>
+      </w:r>
+    </w:p>
+    <w:p>
+      <w:pPr>
+        <w:pStyle w:val="ListParagraph"/>
+        <w:numPr>
+          <w:ilvl w:val="0"/>
+          <w:numId w:val="2"/>
+        </w:numPr>
+        <w:rPr>
+          <w:rFonts w:ascii="Times New Roman" w:hAnsi="Times New Roman" w:cs="Times New Roman"/>
+          <w:sz w:val="28"/>
+          <w:szCs w:val="28"/>
+        </w:rPr>
+      </w:pPr>
+      <w:r>
+        <w:rPr>
+          <w:rFonts w:ascii="Times New Roman" w:hAnsi="Times New Roman" w:cs="Times New Roman"/>
+          <w:sz w:val="28"/>
+          <w:szCs w:val="28"/>
+          <w:lang w:val="en-US"/>
+        </w:rPr>
+        <w:t>User nhập vào ô “Chính sách” thông tin về dòng xe, màu xe, năm sản xuất cần bán cho khách hàng</w:t>
+      </w:r>
+    </w:p>
+    <w:p>
+      <w:pPr>
+        <w:pStyle w:val="ListParagraph"/>
+        <w:numPr>
+          <w:ilvl w:val="0"/>
+          <w:numId w:val="2"/>
+        </w:numPr>
+        <w:rPr>
+          <w:rFonts w:ascii="Times New Roman" w:hAnsi="Times New Roman" w:cs="Times New Roman"/>
+          <w:sz w:val="28"/>
+          <w:szCs w:val="28"/>
+        </w:rPr>
+      </w:pPr>
+      <w:r>
+        <w:rPr>
+          <w:rFonts w:ascii="Times New Roman" w:hAnsi="Times New Roman" w:cs="Times New Roman"/>
+          <w:sz w:val="28"/>
+          <w:szCs w:val="28"/>
+          <w:lang w:val="en-US"/>
+        </w:rPr>
+        <w:t>User lựa chọn đúng Nhóm đối tượng khách hàng, cập nhật đầy đủ chương trình giảm giá, sự kiện (nếu có). Kiểm tra đúng số tiền thanh toán của khách.</w:t>
+      </w:r>
+    </w:p>
+    <w:p>
+      <w:pPr>
+        <w:pStyle w:val="ListParagraph"/>
+        <w:numPr>
+          <w:ilvl w:val="0"/>
+          <w:numId w:val="2"/>
+        </w:numPr>
+        <w:rPr>
+          <w:rFonts w:ascii="Times New Roman" w:hAnsi="Times New Roman" w:cs="Times New Roman"/>
+          <w:sz w:val="28"/>
+          <w:szCs w:val="28"/>
+        </w:rPr>
+      </w:pPr>
+      <w:r>
+        <w:rPr>
+          <w:rFonts w:ascii="Times New Roman" w:hAnsi="Times New Roman" w:cs="Times New Roman"/>
+          <w:sz w:val="28"/>
+          <w:szCs w:val="28"/>
+          <w:lang w:val="en-US"/>
+        </w:rPr>
+        <w:t>Kiểm tra hợp đồng là trả thẳng hay trả góp, các lần thanh toán của khách hàng, ngân hàng dự kiến vay (đối với trả góp).</w:t>
+      </w:r>
+    </w:p>
+    <w:p>
+      <w:pPr>
+        <w:pStyle w:val="ListParagraph"/>
+        <w:numPr>
+          <w:ilvl w:val="0"/>
+          <w:numId w:val="2"/>
+        </w:numPr>
+        <w:rPr>
+          <w:rFonts w:ascii="Times New Roman" w:hAnsi="Times New Roman" w:cs="Times New Roman"/>
+          <w:sz w:val="28"/>
+          <w:szCs w:val="28"/>
+        </w:rPr>
+      </w:pPr>
+      <w:r>
+        <w:rPr>
+          <w:rFonts w:ascii="Times New Roman" w:hAnsi="Times New Roman" w:cs="Times New Roman"/>
+          <w:sz w:val="28"/>
+          <w:szCs w:val="28"/>
         </w:rPr>
         <w:t>Sau khi nhập đầy đủ thông tin User</w:t>
       </w:r>
@@ -4462,6 +4564,7 @@
           <w:sz w:val="28"/>
           <w:szCs w:val="28"/>
         </w:rPr>
+        <w:lastRenderedPageBreak/>
         <w:t xml:space="preserve">Để sửa được hợp đồng thì User </w:t>
       </w:r>
       <w:r>
@@ -4548,8 +4651,9 @@
           <w:iCs/>
           <w:sz w:val="28"/>
           <w:szCs w:val="28"/>
-        </w:rPr>
-        <w:t>lập tạm</w:t>
+          <w:lang w:val="en-US"/>
+        </w:rPr>
+        <w:t>L</w:t>
       </w:r>
       <w:r>
         <w:rPr>
@@ -4559,6 +4663,16 @@
           <w:sz w:val="28"/>
           <w:szCs w:val="28"/>
         </w:rPr>
+        <w:t>ập tạm</w:t>
+      </w:r>
+      <w:r>
+        <w:rPr>
+          <w:rFonts w:ascii="Times New Roman" w:hAnsi="Times New Roman" w:cs="Times New Roman"/>
+          <w:i/>
+          <w:iCs/>
+          <w:sz w:val="28"/>
+          <w:szCs w:val="28"/>
+        </w:rPr>
         <w:t>”</w:t>
       </w:r>
       <w:r>
@@ -4600,6 +4714,15 @@
           <w:szCs w:val="28"/>
         </w:rPr>
         <w:t>liên hệ đến Sale Admin</w:t>
+      </w:r>
+      <w:r>
+        <w:rPr>
+          <w:rFonts w:ascii="Times New Roman" w:hAnsi="Times New Roman" w:cs="Times New Roman"/>
+          <w:sz w:val="28"/>
+          <w:szCs w:val="28"/>
+          <w:lang w:val="en-US"/>
+        </w:rPr>
+        <w:t>.</w:t>
       </w:r>
     </w:p>
     <w:p>
@@ -4697,19 +4820,21 @@
           <w:iCs/>
           <w:sz w:val="28"/>
           <w:szCs w:val="28"/>
-        </w:rPr>
-        <w:t>Các ký tự hay các chữ có kí hiệu là màu đỏ</w:t>
+          <w:lang w:val="en-US"/>
+        </w:rPr>
+        <w:t xml:space="preserve">Các trường thông tin có dấu </w:t>
       </w:r>
       <w:r>
         <w:rPr>
           <w:rFonts w:ascii="Times New Roman" w:hAnsi="Times New Roman" w:cs="Times New Roman"/>
           <w:i/>
           <w:iCs/>
-          <w:color w:val="EE0000"/>
-          <w:sz w:val="28"/>
-          <w:szCs w:val="28"/>
-        </w:rPr>
-        <w:t xml:space="preserve"> </w:t>
+          <w:color w:val="FF0000"/>
+          <w:sz w:val="28"/>
+          <w:szCs w:val="28"/>
+          <w:lang w:val="en-US"/>
+        </w:rPr>
+        <w:t>(*)</w:t>
       </w:r>
       <w:r>
         <w:rPr>
@@ -4718,46 +4843,18 @@
           <w:iCs/>
           <w:sz w:val="28"/>
           <w:szCs w:val="28"/>
-        </w:rPr>
-        <w:t>trên phiếu có ý nghĩa là các trường đó phải bắt buộc nhậ</w:t>
-      </w:r>
-      <w:r>
-        <w:rPr>
-          <w:rFonts w:ascii="Times New Roman" w:hAnsi="Times New Roman" w:cs="Times New Roman"/>
-          <w:i/>
-          <w:iCs/>
-          <w:sz w:val="28"/>
-          <w:szCs w:val="28"/>
-        </w:rPr>
-        <w:t>p</w:t>
-      </w:r>
-    </w:p>
-    <w:p>
-      <w:pPr>
-        <w:rPr>
-          <w:rFonts w:ascii="Times New Roman" w:eastAsiaTheme="majorEastAsia" w:hAnsi="Times New Roman" w:cs="Times New Roman"/>
-          <w:color w:val="2E74B5" w:themeColor="accent1" w:themeShade="BF"/>
-          <w:sz w:val="28"/>
-          <w:szCs w:val="28"/>
-        </w:rPr>
+          <w:lang w:val="en-US"/>
+        </w:rPr>
+        <w:t xml:space="preserve"> là bắt buộc nhập.</w:t>
+      </w:r>
+    </w:p>
+    <w:p>
+      <w:pPr>
+        <w:pStyle w:val="Heading1"/>
       </w:pPr>
       <w:bookmarkStart w:id="17" w:name="_Toc236661317"/>
-      <w:r>
-        <w:rPr>
-          <w:rFonts w:ascii="Times New Roman" w:hAnsi="Times New Roman" w:cs="Times New Roman"/>
-          <w:sz w:val="28"/>
-          <w:szCs w:val="28"/>
-        </w:rPr>
-        <w:br w:type="page"/>
-      </w:r>
-    </w:p>
-    <w:p>
-      <w:pPr>
-        <w:pStyle w:val="Heading1"/>
-      </w:pPr>
       <w:bookmarkStart w:id="18" w:name="_Toc236662566"/>
       <w:r>
-        <w:lastRenderedPageBreak/>
         <w:t>Phụ kiện, bảo hiểm, chi phí kèm theo xe</w:t>
       </w:r>
       <w:bookmarkEnd w:id="17"/>
@@ -5074,6 +5171,7 @@
           <w:sz w:val="28"/>
           <w:szCs w:val="28"/>
         </w:rPr>
+        <w:lastRenderedPageBreak/>
         <w:t xml:space="preserve">User nhập tên khách hàng vào </w:t>
       </w:r>
       <w:r>
@@ -7273,8 +7371,8 @@
   <w:abstractNum w:abstractNumId="3">
     <w:nsid w:val="50A9236A"/>
     <w:multiLevelType w:val="hybridMultilevel"/>
-    <w:tmpl w:val="5E02096A"/>
-    <w:lvl w:ilvl="0" w:tplc="9036E068">
+    <w:tmpl w:val="32401364"/>
+    <w:lvl w:ilvl="0" w:tplc="3BB85446">
       <w:start w:val="1"/>
       <w:numFmt w:val="decimal"/>
       <w:pStyle w:val="Heading1"/>
@@ -7809,7 +7907,7 @@
     <w:link w:val="Heading1Char"/>
     <w:uiPriority w:val="9"/>
     <w:qFormat/>
-    <w:rsid w:val="005B28D5"/>
+    <w:rsid w:val="00F7616F"/>
     <w:pPr>
       <w:keepNext/>
       <w:keepLines/>
@@ -7822,6 +7920,7 @@
     </w:pPr>
     <w:rPr>
       <w:rFonts w:ascii="Times New Roman" w:eastAsiaTheme="majorEastAsia" w:hAnsi="Times New Roman" w:cs="Times New Roman"/>
+      <w:b/>
       <w:sz w:val="28"/>
       <w:szCs w:val="28"/>
     </w:rPr>
@@ -7893,9 +7992,10 @@
     <w:basedOn w:val="DefaultParagraphFont"/>
     <w:link w:val="Heading1"/>
     <w:uiPriority w:val="9"/>
-    <w:rsid w:val="005B28D5"/>
+    <w:rsid w:val="00F7616F"/>
     <w:rPr>
       <w:rFonts w:ascii="Times New Roman" w:eastAsiaTheme="majorEastAsia" w:hAnsi="Times New Roman" w:cs="Times New Roman"/>
+      <w:b/>
       <w:noProof/>
       <w:sz w:val="28"/>
       <w:szCs w:val="28"/>
@@ -8348,7 +8448,7 @@
 </file>
 
 <file path=customXml/itemProps1.xml><?xml version="1.0" encoding="utf-8"?>
-<ds:datastoreItem xmlns:ds="http://schemas.openxmlformats.org/officeDocument/2006/customXml" ds:itemID="{5C711EB5-ABAF-4709-AFEC-B2271558E58B}">
+<ds:datastoreItem xmlns:ds="http://schemas.openxmlformats.org/officeDocument/2006/customXml" ds:itemID="{67EB1CD4-234E-413E-B1AF-521BB301679B}">
   <ds:schemaRefs>
     <ds:schemaRef ds:uri="http://schemas.openxmlformats.org/officeDocument/2006/bibliography"/>
   </ds:schemaRefs>

</xml_diff>